<commit_message>
Trim ancillary docs from repo and document dataset acquisition
Removes the university writing template, the standalone Chapter 4
outline and the pilot demo guide from the tracked repository since
they are either external references or private working material not
intended for public consumption. Adds an OULAD dataset section to the
README describing how a reviewer can obtain and place the raw CSVs to
regenerate the training data and the model artifact. Refreshes the
dissertation working file with the latest revisions and removes the
now-broken references to the deleted pilot demo guide from the seeder
management command.
</commit_message>
<xml_diff>
--- a/Resources/Chapters 1-5 - Final.docx
+++ b/Resources/Chapters 1-5 - Final.docx
@@ -675,7 +675,21 @@
           <w:bCs/>
         </w:rPr>
         <w:softHyphen/>
-        <w:t>______________</w:t>
+        <w:t>______</w:t>
+      </w:r>
+      <w:r>
+        <w:rPr>
+          <w:rFonts w:ascii="Times New Roman" w:hAnsi="Times New Roman" w:cs="Times New Roman"/>
+          <w:bCs/>
+        </w:rPr>
+        <w:t>7/06/2026</w:t>
+      </w:r>
+      <w:r>
+        <w:rPr>
+          <w:rFonts w:ascii="Times New Roman" w:hAnsi="Times New Roman" w:cs="Times New Roman"/>
+          <w:bCs/>
+        </w:rPr>
+        <w:t>________</w:t>
       </w:r>
     </w:p>
     <w:p>
@@ -2939,6 +2953,34 @@
       <w:r>
         <w:tab/>
         <w:t>5.3 Recommendation</w:t>
+      </w:r>
+      <w:r>
+        <w:tab/>
+      </w:r>
+      <w:r>
+        <w:tab/>
+      </w:r>
+      <w:r>
+        <w:tab/>
+      </w:r>
+      <w:r>
+        <w:tab/>
+      </w:r>
+      <w:r>
+        <w:tab/>
+      </w:r>
+      <w:r>
+        <w:tab/>
+      </w:r>
+      <w:r>
+        <w:tab/>
+      </w:r>
+      <w:r>
+        <w:tab/>
+      </w:r>
+      <w:r>
+        <w:tab/>
+        <w:t>71</w:t>
       </w:r>
     </w:p>
     <w:p>
@@ -4316,7 +4358,13 @@
     </w:p>
     <w:p>
       <w:r>
-        <w:t>Self-regulated learning (SRL) is the capacity of the learner to plan, monitor and evaluate his or her learning activity. It also involves learners assessing the cognitive, motivational and behavioural activities. SRL encompasses a broad field that influences the process of learning and includes cognitive processes, metacognitive mindfulness, motivation and regulating emotions hence, it is an inclusive model to examine how students become engaged in academic pursuits (Panadero, 2017). Self-regulated learners are self directed students who assume the roles involved in goal setting and change of strategies in their learning in order to attain what they want.</w:t>
+        <w:t xml:space="preserve">Self-regulated learning (SRL) is the capacity of the learner to plan, monitor and evaluate his or her learning activity. It also involves learners assessing the cognitive, motivational and behavioural activities. SRL encompasses a broad field that influences the process of learning and includes cognitive processes, metacognitive mindfulness, motivation and regulating emotions hence, it is an inclusive model to examine how students become engaged in academic pursuits (Panadero, 2017). Self-regulated learners are </w:t>
+      </w:r>
+      <w:r>
+        <w:t>self-directed</w:t>
+      </w:r>
+      <w:r>
+        <w:t xml:space="preserve"> students who assume the roles involved in goal setting and change of strategies in their learning in order to attain what they want.</w:t>
       </w:r>
     </w:p>
     <w:p/>
@@ -4757,7 +4805,13 @@
     <w:p/>
     <w:p>
       <w:r>
-        <w:t>Current AI driven systems in educational contexts are often designed as single standalone tools that address specific aspects of learning like content adaptation or performance forecasting. They do not integrate core self-regulated learning processes like goal setting, time management and reflective feedback. This lack of integration reduces their effectiveness in helping students develop good study habits. Many systems are developed and evaluated in well resourced contexts with limited consideration for various constraints in developing higher education environments thereby restricting their applicability and impact in contexts like Nigerian universities.</w:t>
+        <w:t xml:space="preserve">Current AI driven systems in educational contexts are often designed as single standalone tools that address specific aspects of learning like content adaptation or performance forecasting. They do not integrate core self-regulated learning processes like goal setting, time management and reflective feedback. This lack of integration reduces their effectiveness in helping students develop good study habits. Many systems are developed and evaluated in </w:t>
+      </w:r>
+      <w:r>
+        <w:t>well-resourced</w:t>
+      </w:r>
+      <w:r>
+        <w:t xml:space="preserve"> contexts with limited consideration for various constraints in developing higher education environments thereby restricting their applicability and impact in contexts like Nigerian universities.</w:t>
       </w:r>
     </w:p>
     <w:p>
@@ -4806,7 +4860,13 @@
     </w:p>
     <w:p>
       <w:r>
-        <w:t>This chapter reviewed some literature on self-regulated learning, learning analytics, artificial intelligence in education, and mobile based learning support systems. The review showed that SRL is central to academic success with its integrated cycle of forethought, performance, and self reflection. It was also established that students often require external support to navigate the SRL cycle. It also highlighted the role of learning analytics and AI in providing personalised feedback, adaptive support and data driven insights to enhance students’ learning experiences.</w:t>
+        <w:t xml:space="preserve">This chapter reviewed some literature on self-regulated learning, learning analytics, artificial intelligence in education, and mobile based learning support systems. The review showed that SRL is central to academic success with its integrated cycle of forethought, performance, and </w:t>
+      </w:r>
+      <w:r>
+        <w:t>self-reflection</w:t>
+      </w:r>
+      <w:r>
+        <w:t>. It was also established that students often require external support to navigate the SRL cycle. It also highlighted the role of learning analytics and AI in providing personalised feedback, adaptive support and data driven insights to enhance students’ learning experiences.</w:t>
       </w:r>
     </w:p>
     <w:p/>
@@ -5296,15 +5356,7 @@
     </w:p>
     <w:p>
       <w:r>
-        <w:t xml:space="preserve">The reviewed systems have intelligent features like automated reminders, adaptive content delivery using artificial </w:t>
-      </w:r>
-      <w:proofErr w:type="gramStart"/>
-      <w:r>
-        <w:t>intelligence based</w:t>
-      </w:r>
-      <w:proofErr w:type="gramEnd"/>
-      <w:r>
-        <w:t xml:space="preserve"> algorithms,  digital timetable support and study planning to assist students with study organisation. These features are made to work independently and do not collectively support personalised time management through adaptive measures and intelligent learning recommendation prescriptions. </w:t>
+        <w:t xml:space="preserve">The reviewed systems have intelligent features like automated reminders, adaptive content delivery using artificial intelligence based algorithms,  digital timetable support and study planning to assist students with study organisation. These features are made to work independently and do not collectively support personalised time management through adaptive measures and intelligent learning recommendation prescriptions. </w:t>
       </w:r>
     </w:p>
     <w:p/>
@@ -5343,15 +5395,7 @@
     </w:p>
     <w:p>
       <w:r>
-        <w:t xml:space="preserve">Current learning systems are mostly content delivery systems, just like the digital libraries or lecture halls, where students have access to learning materials but the systems do not actively manage the study activities of the students. The suggested system is intended to run as an intelligent study manager overlaying these platforms combining artificial intelligence, learning analytics and self-regulated learning philosophies to help manage adaptive study schedule planning and provide learning strategy advice. The system is able to coordinate and optimise study activities across courses by analysing learner behaviour and academic requirements as well as available study time which is an issue with the current systems where scheduling, analytics and smart support have been adopted on an individual basis. This holistic </w:t>
-      </w:r>
-      <w:proofErr w:type="gramStart"/>
-      <w:r>
-        <w:t>student based</w:t>
-      </w:r>
-      <w:proofErr w:type="gramEnd"/>
-      <w:r>
-        <w:t xml:space="preserve"> learning support system offers a student centred approach to the learning process that facilitates good study habits and academic success.</w:t>
+        <w:t>Current learning systems are mostly content delivery systems, just like the digital libraries or lecture halls, where students have access to learning materials but the systems do not actively manage the study activities of the students. The suggested system is intended to run as an intelligent study manager overlaying these platforms combining artificial intelligence, learning analytics and self-regulated learning philosophies to help manage adaptive study schedule planning and provide learning strategy advice. The system is able to coordinate and optimise study activities across courses by analysing learner behaviour and academic requirements as well as available study time which is an issue with the current systems where scheduling, analytics and smart support have been adopted on an individual basis. This holistic student based learning support system offers a student centred approach to the learning process that facilitates good study habits and academic success.</w:t>
       </w:r>
     </w:p>
     <w:p>
@@ -5711,15 +5755,7 @@
         <w:t>Figure 3.6</w:t>
       </w:r>
       <w:r>
-        <w:t xml:space="preserve">. The diagram shows the way the data related to learners is gathered, processed to create and optimize a personalized study schedule, and assisted by the progress tracking as well as the smart notifications, which reflect the adaptive and </w:t>
-      </w:r>
-      <w:proofErr w:type="gramStart"/>
-      <w:r>
-        <w:t>feedback based</w:t>
-      </w:r>
-      <w:proofErr w:type="gramEnd"/>
-      <w:r>
-        <w:t xml:space="preserve"> nature of the system.</w:t>
+        <w:t>. The diagram shows the way the data related to learners is gathered, processed to create and optimize a personalized study schedule, and assisted by the progress tracking as well as the smart notifications, which reflect the adaptive and feedback based nature of the system.</w:t>
       </w:r>
     </w:p>
     <w:p/>
@@ -6218,15 +6254,7 @@
     </w:p>
     <w:p>
       <w:r>
-        <w:t xml:space="preserve">The proposed system will take a mobile based, client-server architecture model that is aimed at providing personalised study planning and learning recommendation to the students. The mobile-first frontend interface allows students to use the system on a handheld device whereas a robust backend service can process and make informed decisions and integrate the system. The intelligence of the system is a combination of </w:t>
-      </w:r>
-      <w:proofErr w:type="gramStart"/>
-      <w:r>
-        <w:t>rule based</w:t>
-      </w:r>
-      <w:proofErr w:type="gramEnd"/>
-      <w:r>
-        <w:t xml:space="preserve"> reasoning with simple machine learning methods used to assist the adaptive management of the study timetable and recommending the learning strategies. Relational database management system is employed to uphold dependable storage of user information, educational records and learning analytics, as well as the support tools that contribute to the security and maintainability. Beyond the selected frontend, backend and database technologies, the proposed system also follows a structured artificial intelligence methodology to ensure that its intelligent functions are implemented in a measurable way. This methodology defines the workflow for learner data collection, training dataset preparation, feature engineering, model training, model testing and deployment for recommendation and timetable optimisation.</w:t>
+        <w:t>The proposed system will take a mobile based, client-server architecture model that is aimed at providing personalised study planning and learning recommendation to the students. The mobile-first frontend interface allows students to use the system on a handheld device whereas a robust backend service can process and make informed decisions and integrate the system. The intelligence of the system is a combination of rule based reasoning with simple machine learning methods used to assist the adaptive management of the study timetable and recommending the learning strategies. Relational database management system is employed to uphold dependable storage of user information, educational records and learning analytics, as well as the support tools that contribute to the security and maintainability. Beyond the selected frontend, backend and database technologies, the proposed system also follows a structured artificial intelligence methodology to ensure that its intelligent functions are implemented in a measurable way. This methodology defines the workflow for learner data collection, training dataset preparation, feature engineering, model training, model testing and deployment for recommendation and timetable optimisation.</w:t>
       </w:r>
     </w:p>
     <w:p>
@@ -6406,15 +6434,7 @@
         <w:t xml:space="preserve">Rule-Based Recommendation Engine with scikit-learn (Python): </w:t>
       </w:r>
       <w:r>
-        <w:t xml:space="preserve">A backend recommendation module implemented in Python that combines a </w:t>
-      </w:r>
-      <w:proofErr w:type="gramStart"/>
-      <w:r>
-        <w:t>rule based</w:t>
-      </w:r>
-      <w:proofErr w:type="gramEnd"/>
-      <w:r>
-        <w:t xml:space="preserve"> logic with basic machine learning techniques using the scikit-learn.</w:t>
+        <w:t>A backend recommendation module implemented in Python that combines a rule based logic with basic machine learning techniques using the scikit-learn.</w:t>
       </w:r>
     </w:p>
     <w:p>
@@ -6823,15 +6843,7 @@
       </w:r>
       <w:r>
         <w:lastRenderedPageBreak/>
-        <w:t xml:space="preserve">qualitatively against expected strategy patterns. To validate the intelligence contribution of the system, machine learning outputs are compared against baseline </w:t>
-      </w:r>
-      <w:proofErr w:type="gramStart"/>
-      <w:r>
-        <w:t>rule based</w:t>
-      </w:r>
-      <w:proofErr w:type="gramEnd"/>
-      <w:r>
-        <w:t xml:space="preserve"> outputs.</w:t>
+        <w:t>qualitatively against expected strategy patterns. To validate the intelligence contribution of the system, machine learning outputs are compared against baseline rule based outputs.</w:t>
       </w:r>
     </w:p>
     <w:p>
@@ -9109,7 +9121,7 @@
         </w:rPr>
         <w:lastRenderedPageBreak/>
         <w:drawing>
-          <wp:anchor distT="0" distB="0" distL="114300" distR="114300" simplePos="0" relativeHeight="251679744" behindDoc="0" locked="0" layoutInCell="1" allowOverlap="1" wp14:anchorId="263A60D0" wp14:editId="277B1FC0">
+          <wp:anchor distT="0" distB="0" distL="114300" distR="114300" simplePos="0" relativeHeight="251679744" behindDoc="0" locked="0" layoutInCell="1" allowOverlap="1" wp14:anchorId="263A60D0" wp14:editId="4D89DB33">
             <wp:simplePos x="0" y="0"/>
             <wp:positionH relativeFrom="column">
               <wp:posOffset>473406</wp:posOffset>
@@ -9669,7 +9681,7 @@
         </w:rPr>
         <w:lastRenderedPageBreak/>
         <w:drawing>
-          <wp:anchor distT="0" distB="0" distL="114300" distR="114300" simplePos="0" relativeHeight="251682816" behindDoc="0" locked="0" layoutInCell="1" allowOverlap="1" wp14:anchorId="0CBD7BC3" wp14:editId="44C3D2CF">
+          <wp:anchor distT="0" distB="0" distL="114300" distR="114300" simplePos="0" relativeHeight="251682816" behindDoc="0" locked="0" layoutInCell="1" allowOverlap="1" wp14:anchorId="0CBD7BC3" wp14:editId="1477A88D">
             <wp:simplePos x="0" y="0"/>
             <wp:positionH relativeFrom="column">
               <wp:posOffset>417526</wp:posOffset>
@@ -10693,19 +10705,11 @@
         </w:rPr>
         <w:t xml:space="preserve">  </w:t>
       </w:r>
-      <w:proofErr w:type="spellStart"/>
       <w:r>
         <w:rPr>
           <w:lang w:val="en-GB"/>
         </w:rPr>
-        <w:t>Oulasvirta</w:t>
-      </w:r>
-      <w:proofErr w:type="spellEnd"/>
-      <w:r>
-        <w:rPr>
-          <w:lang w:val="en-GB"/>
-        </w:rPr>
-        <w:t xml:space="preserve">, A., Rattenbury, T., Ma, L., &amp; Raita, E. (2012). Habits make smartphone use more pervasive. </w:t>
+        <w:t xml:space="preserve">Oulasvirta, A., Rattenbury, T., Ma, L., &amp; Raita, E. (2012). Habits make smartphone use more pervasive. </w:t>
       </w:r>
       <w:r>
         <w:rPr>
@@ -26944,6 +26948,7 @@
   <w:style w:type="character" w:default="1" w:styleId="DefaultParagraphFont">
     <w:name w:val="Default Paragraph Font"/>
     <w:uiPriority w:val="1"/>
+    <w:semiHidden/>
     <w:unhideWhenUsed/>
   </w:style>
   <w:style w:type="table" w:default="1" w:styleId="TableNormal">
@@ -29074,6 +29079,7 @@
     <w:rsid w:val="000C7148"/>
     <w:rsid w:val="00101378"/>
     <w:rsid w:val="001B6B0E"/>
+    <w:rsid w:val="00246D23"/>
     <w:rsid w:val="00340F26"/>
     <w:rsid w:val="00540A31"/>
     <w:rsid w:val="00572786"/>
@@ -29081,6 +29087,7 @@
     <w:rsid w:val="0063093F"/>
     <w:rsid w:val="00672237"/>
     <w:rsid w:val="006E58D1"/>
+    <w:rsid w:val="006F53F2"/>
     <w:rsid w:val="00715847"/>
     <w:rsid w:val="00732168"/>
     <w:rsid w:val="00776484"/>
@@ -29553,14 +29560,6 @@
       <w:iCs/>
     </w:rPr>
   </w:style>
-  <w:style w:type="paragraph" w:customStyle="1" w:styleId="C8FCA1FEF9764A6898D8E598F124260C">
-    <w:name w:val="C8FCA1FEF9764A6898D8E598F124260C"/>
-    <w:rsid w:val="0057680F"/>
-  </w:style>
-  <w:style w:type="paragraph" w:customStyle="1" w:styleId="BA877C14DCD04C1C9321A928EF55D1DB">
-    <w:name w:val="BA877C14DCD04C1C9321A928EF55D1DB"/>
-    <w:rsid w:val="0057680F"/>
-  </w:style>
 </w:styles>
 </file>
 

</xml_diff>